<commit_message>
bugfix/ when entity is jump_descending and player moves left or right the state does not switch to overall_descending
</commit_message>
<xml_diff>
--- a/documentation/docs/BACKLOG.docx
+++ b/documentation/docs/BACKLOG.docx
@@ -8,8 +8,8 @@
           <w:rFonts w:ascii="Times New Roman" w:hAnsi="Times New Roman" w:cs="Times New Roman"/>
           <w:b/>
           <w:bCs/>
-          <w:sz w:val="36"/>
-          <w:szCs w:val="36"/>
+          <w:sz w:val="44"/>
+          <w:szCs w:val="44"/>
         </w:rPr>
       </w:pPr>
       <w:r>
@@ -17,8 +17,8 @@
           <w:rFonts w:ascii="Times New Roman" w:hAnsi="Times New Roman" w:cs="Times New Roman"/>
           <w:b/>
           <w:bCs/>
-          <w:sz w:val="36"/>
-          <w:szCs w:val="36"/>
+          <w:sz w:val="44"/>
+          <w:szCs w:val="44"/>
         </w:rPr>
         <w:t>BACKLOG</w:t>
       </w:r>
@@ -55,8 +55,8 @@
           <w:rFonts w:ascii="Times New Roman" w:hAnsi="Times New Roman" w:cs="Times New Roman"/>
           <w:b/>
           <w:bCs/>
-          <w:sz w:val="28"/>
-          <w:szCs w:val="28"/>
+          <w:sz w:val="40"/>
+          <w:szCs w:val="40"/>
         </w:rPr>
       </w:pPr>
       <w:r>
@@ -64,8 +64,8 @@
           <w:rFonts w:ascii="Times New Roman" w:hAnsi="Times New Roman" w:cs="Times New Roman"/>
           <w:b/>
           <w:bCs/>
-          <w:sz w:val="28"/>
-          <w:szCs w:val="28"/>
+          <w:sz w:val="40"/>
+          <w:szCs w:val="40"/>
         </w:rPr>
         <w:t>BUGFIX</w:t>
       </w:r>
@@ -74,11 +74,19 @@
       <w:pPr>
         <w:rPr>
           <w:rFonts w:ascii="Times New Roman" w:hAnsi="Times New Roman" w:cs="Times New Roman"/>
-        </w:rPr>
-      </w:pPr>
-      <w:r>
-        <w:rPr>
-          <w:rFonts w:ascii="Times New Roman" w:hAnsi="Times New Roman" w:cs="Times New Roman"/>
+          <w:b/>
+          <w:bCs/>
+          <w:sz w:val="32"/>
+          <w:szCs w:val="32"/>
+        </w:rPr>
+      </w:pPr>
+      <w:r>
+        <w:rPr>
+          <w:rFonts w:ascii="Times New Roman" w:hAnsi="Times New Roman" w:cs="Times New Roman"/>
+          <w:b/>
+          <w:bCs/>
+          <w:sz w:val="32"/>
+          <w:szCs w:val="32"/>
         </w:rPr>
         <w:t>ENGINE</w:t>
       </w:r>
@@ -223,85 +231,28 @@
         <w:rPr>
           <w:rFonts w:ascii="Times New Roman" w:hAnsi="Times New Roman" w:cs="Times New Roman"/>
         </w:rPr>
-        <w:t xml:space="preserve">+ entities while ai switching to </w:t>
-      </w:r>
-      <w:proofErr w:type="spellStart"/>
-      <w:r>
-        <w:rPr>
-          <w:rFonts w:ascii="Times New Roman" w:hAnsi="Times New Roman" w:cs="Times New Roman"/>
-        </w:rPr>
-        <w:t>aggro</w:t>
-      </w:r>
-      <w:proofErr w:type="spellEnd"/>
-      <w:r>
-        <w:rPr>
-          <w:rFonts w:ascii="Times New Roman" w:hAnsi="Times New Roman" w:cs="Times New Roman"/>
-        </w:rPr>
-        <w:t xml:space="preserve"> </w:t>
-      </w:r>
-      <w:proofErr w:type="spellStart"/>
-      <w:r>
-        <w:rPr>
-          <w:rFonts w:ascii="Times New Roman" w:hAnsi="Times New Roman" w:cs="Times New Roman"/>
-        </w:rPr>
-        <w:t>behaviour</w:t>
-      </w:r>
-      <w:proofErr w:type="spellEnd"/>
-      <w:r>
-        <w:rPr>
-          <w:rFonts w:ascii="Times New Roman" w:hAnsi="Times New Roman" w:cs="Times New Roman"/>
-        </w:rPr>
-        <w:t xml:space="preserve"> case don’t instantly perform </w:t>
-      </w:r>
-      <w:proofErr w:type="spellStart"/>
-      <w:r>
-        <w:rPr>
-          <w:rFonts w:ascii="Times New Roman" w:hAnsi="Times New Roman" w:cs="Times New Roman"/>
-        </w:rPr>
-        <w:t>aggro</w:t>
-      </w:r>
-      <w:proofErr w:type="spellEnd"/>
-      <w:r>
-        <w:rPr>
-          <w:rFonts w:ascii="Times New Roman" w:hAnsi="Times New Roman" w:cs="Times New Roman"/>
-        </w:rPr>
-        <w:t xml:space="preserve"> commands algorithm</w:t>
-      </w:r>
-    </w:p>
-    <w:p>
-      <w:pPr>
-        <w:rPr>
-          <w:rFonts w:ascii="Times New Roman" w:hAnsi="Times New Roman" w:cs="Times New Roman"/>
-        </w:rPr>
-      </w:pPr>
-      <w:r>
-        <w:rPr>
-          <w:rFonts w:ascii="Times New Roman" w:hAnsi="Times New Roman" w:cs="Times New Roman"/>
-        </w:rPr>
-        <w:t xml:space="preserve">+ when entity is </w:t>
-      </w:r>
-      <w:proofErr w:type="spellStart"/>
-      <w:r>
-        <w:rPr>
-          <w:rFonts w:ascii="Times New Roman" w:hAnsi="Times New Roman" w:cs="Times New Roman"/>
-        </w:rPr>
-        <w:t>jump_descending</w:t>
-      </w:r>
-      <w:proofErr w:type="spellEnd"/>
-      <w:r>
-        <w:rPr>
-          <w:rFonts w:ascii="Times New Roman" w:hAnsi="Times New Roman" w:cs="Times New Roman"/>
-        </w:rPr>
-        <w:t xml:space="preserve"> and player moves left or right the state does not switch to </w:t>
-      </w:r>
-      <w:proofErr w:type="spellStart"/>
-      <w:r>
-        <w:rPr>
-          <w:rFonts w:ascii="Times New Roman" w:hAnsi="Times New Roman" w:cs="Times New Roman"/>
-        </w:rPr>
-        <w:t>overall_descending</w:t>
-      </w:r>
-      <w:proofErr w:type="spellEnd"/>
+        <w:t>+ entities while ai switching to aggro behaviour case don’t instantly perform aggro commands algorithm</w:t>
+      </w:r>
+    </w:p>
+    <w:p>
+      <w:pPr>
+        <w:rPr>
+          <w:rFonts w:ascii="Times New Roman" w:hAnsi="Times New Roman" w:cs="Times New Roman"/>
+        </w:rPr>
+      </w:pPr>
+      <w:r>
+        <w:rPr>
+          <w:rFonts w:ascii="Times New Roman" w:hAnsi="Times New Roman" w:cs="Times New Roman"/>
+          <w:strike/>
+        </w:rPr>
+        <w:t>+ when entity is jump_descending and player moves left or right the state does not switch to overall_descending</w:t>
+      </w:r>
+      <w:r>
+        <w:rPr>
+          <w:rFonts w:ascii="Times New Roman" w:hAnsi="Times New Roman" w:cs="Times New Roman"/>
+        </w:rPr>
+        <w:t xml:space="preserve"> 10.08.2025</w:t>
+      </w:r>
     </w:p>
     <w:p>
       <w:pPr>
@@ -360,11 +311,19 @@
       <w:pPr>
         <w:rPr>
           <w:rFonts w:ascii="Times New Roman" w:hAnsi="Times New Roman" w:cs="Times New Roman"/>
-        </w:rPr>
-      </w:pPr>
-      <w:r>
-        <w:rPr>
-          <w:rFonts w:ascii="Times New Roman" w:hAnsi="Times New Roman" w:cs="Times New Roman"/>
+          <w:b/>
+          <w:bCs/>
+          <w:sz w:val="32"/>
+          <w:szCs w:val="32"/>
+        </w:rPr>
+      </w:pPr>
+      <w:r>
+        <w:rPr>
+          <w:rFonts w:ascii="Times New Roman" w:hAnsi="Times New Roman" w:cs="Times New Roman"/>
+          <w:b/>
+          <w:bCs/>
+          <w:sz w:val="32"/>
+          <w:szCs w:val="32"/>
         </w:rPr>
         <w:t>ASSETS</w:t>
       </w:r>

</xml_diff>

<commit_message>
bugfix/ when block modelstate and blockpressed released the block modelstate stays on
</commit_message>
<xml_diff>
--- a/documentation/docs/BACKLOG.docx
+++ b/documentation/docs/BACKLOG.docx
@@ -191,6 +191,125 @@
       <w:r>
         <w:rPr>
           <w:rFonts w:ascii="Times New Roman" w:hAnsi="Times New Roman" w:cs="Times New Roman"/>
+          <w:strike/>
+        </w:rPr>
+        <w:t xml:space="preserve">+ when block </w:t>
+      </w:r>
+      <w:proofErr w:type="spellStart"/>
+      <w:r>
+        <w:rPr>
+          <w:rFonts w:ascii="Times New Roman" w:hAnsi="Times New Roman" w:cs="Times New Roman"/>
+          <w:strike/>
+        </w:rPr>
+        <w:t>modelstate</w:t>
+      </w:r>
+      <w:proofErr w:type="spellEnd"/>
+      <w:r>
+        <w:rPr>
+          <w:rFonts w:ascii="Times New Roman" w:hAnsi="Times New Roman" w:cs="Times New Roman"/>
+          <w:strike/>
+        </w:rPr>
+        <w:t xml:space="preserve"> and </w:t>
+      </w:r>
+      <w:proofErr w:type="spellStart"/>
+      <w:r>
+        <w:rPr>
+          <w:rFonts w:ascii="Times New Roman" w:hAnsi="Times New Roman" w:cs="Times New Roman"/>
+          <w:strike/>
+        </w:rPr>
+        <w:t>blockpressed</w:t>
+      </w:r>
+      <w:proofErr w:type="spellEnd"/>
+      <w:r>
+        <w:rPr>
+          <w:rFonts w:ascii="Times New Roman" w:hAnsi="Times New Roman" w:cs="Times New Roman"/>
+          <w:strike/>
+        </w:rPr>
+        <w:t xml:space="preserve"> released the block </w:t>
+      </w:r>
+      <w:proofErr w:type="spellStart"/>
+      <w:r>
+        <w:rPr>
+          <w:rFonts w:ascii="Times New Roman" w:hAnsi="Times New Roman" w:cs="Times New Roman"/>
+          <w:strike/>
+        </w:rPr>
+        <w:t>modelstate</w:t>
+      </w:r>
+      <w:proofErr w:type="spellEnd"/>
+      <w:r>
+        <w:rPr>
+          <w:rFonts w:ascii="Times New Roman" w:hAnsi="Times New Roman" w:cs="Times New Roman"/>
+          <w:strike/>
+        </w:rPr>
+        <w:t xml:space="preserve"> stays on</w:t>
+      </w:r>
+      <w:r>
+        <w:rPr>
+          <w:rFonts w:ascii="Times New Roman" w:hAnsi="Times New Roman" w:cs="Times New Roman"/>
+        </w:rPr>
+        <w:t xml:space="preserve"> </w:t>
+      </w:r>
+      <w:r>
+        <w:rPr>
+          <w:rFonts w:ascii="Times New Roman" w:hAnsi="Times New Roman" w:cs="Times New Roman"/>
+        </w:rPr>
+        <w:t>10.08.2025</w:t>
+      </w:r>
+    </w:p>
+    <w:p>
+      <w:pPr>
+        <w:rPr>
+          <w:rFonts w:ascii="Times New Roman" w:hAnsi="Times New Roman" w:cs="Times New Roman"/>
+        </w:rPr>
+      </w:pPr>
+      <w:r>
+        <w:rPr>
+          <w:rFonts w:ascii="Times New Roman" w:hAnsi="Times New Roman" w:cs="Times New Roman"/>
+          <w:strike/>
+        </w:rPr>
+        <w:t xml:space="preserve">+ when entity is </w:t>
+      </w:r>
+      <w:proofErr w:type="spellStart"/>
+      <w:r>
+        <w:rPr>
+          <w:rFonts w:ascii="Times New Roman" w:hAnsi="Times New Roman" w:cs="Times New Roman"/>
+          <w:strike/>
+        </w:rPr>
+        <w:t>jump_descending</w:t>
+      </w:r>
+      <w:proofErr w:type="spellEnd"/>
+      <w:r>
+        <w:rPr>
+          <w:rFonts w:ascii="Times New Roman" w:hAnsi="Times New Roman" w:cs="Times New Roman"/>
+          <w:strike/>
+        </w:rPr>
+        <w:t xml:space="preserve"> and player moves left or right the state does not switch to </w:t>
+      </w:r>
+      <w:proofErr w:type="spellStart"/>
+      <w:r>
+        <w:rPr>
+          <w:rFonts w:ascii="Times New Roman" w:hAnsi="Times New Roman" w:cs="Times New Roman"/>
+          <w:strike/>
+        </w:rPr>
+        <w:t>overall_descending</w:t>
+      </w:r>
+      <w:proofErr w:type="spellEnd"/>
+      <w:r>
+        <w:rPr>
+          <w:rFonts w:ascii="Times New Roman" w:hAnsi="Times New Roman" w:cs="Times New Roman"/>
+        </w:rPr>
+        <w:t xml:space="preserve"> 10.08.2025</w:t>
+      </w:r>
+    </w:p>
+    <w:p>
+      <w:pPr>
+        <w:rPr>
+          <w:rFonts w:ascii="Times New Roman" w:hAnsi="Times New Roman" w:cs="Times New Roman"/>
+        </w:rPr>
+      </w:pPr>
+      <w:r>
+        <w:rPr>
+          <w:rFonts w:ascii="Times New Roman" w:hAnsi="Times New Roman" w:cs="Times New Roman"/>
         </w:rPr>
         <w:t>+ no draw weapon when block</w:t>
       </w:r>
@@ -231,27 +350,49 @@
         <w:rPr>
           <w:rFonts w:ascii="Times New Roman" w:hAnsi="Times New Roman" w:cs="Times New Roman"/>
         </w:rPr>
-        <w:t>+ entities while ai switching to aggro behaviour case don’t instantly perform aggro commands algorithm</w:t>
-      </w:r>
-    </w:p>
-    <w:p>
-      <w:pPr>
-        <w:rPr>
-          <w:rFonts w:ascii="Times New Roman" w:hAnsi="Times New Roman" w:cs="Times New Roman"/>
-        </w:rPr>
-      </w:pPr>
-      <w:r>
-        <w:rPr>
-          <w:rFonts w:ascii="Times New Roman" w:hAnsi="Times New Roman" w:cs="Times New Roman"/>
-          <w:strike/>
-        </w:rPr>
-        <w:t>+ when entity is jump_descending and player moves left or right the state does not switch to overall_descending</w:t>
-      </w:r>
-      <w:r>
-        <w:rPr>
-          <w:rFonts w:ascii="Times New Roman" w:hAnsi="Times New Roman" w:cs="Times New Roman"/>
-        </w:rPr>
-        <w:t xml:space="preserve"> 10.08.2025</w:t>
+        <w:t xml:space="preserve">+ entities while ai switching to </w:t>
+      </w:r>
+      <w:proofErr w:type="spellStart"/>
+      <w:r>
+        <w:rPr>
+          <w:rFonts w:ascii="Times New Roman" w:hAnsi="Times New Roman" w:cs="Times New Roman"/>
+        </w:rPr>
+        <w:t>aggro</w:t>
+      </w:r>
+      <w:proofErr w:type="spellEnd"/>
+      <w:r>
+        <w:rPr>
+          <w:rFonts w:ascii="Times New Roman" w:hAnsi="Times New Roman" w:cs="Times New Roman"/>
+        </w:rPr>
+        <w:t xml:space="preserve"> </w:t>
+      </w:r>
+      <w:proofErr w:type="spellStart"/>
+      <w:r>
+        <w:rPr>
+          <w:rFonts w:ascii="Times New Roman" w:hAnsi="Times New Roman" w:cs="Times New Roman"/>
+        </w:rPr>
+        <w:t>behaviour</w:t>
+      </w:r>
+      <w:proofErr w:type="spellEnd"/>
+      <w:r>
+        <w:rPr>
+          <w:rFonts w:ascii="Times New Roman" w:hAnsi="Times New Roman" w:cs="Times New Roman"/>
+        </w:rPr>
+        <w:t xml:space="preserve"> case don’t instantly perform </w:t>
+      </w:r>
+      <w:proofErr w:type="spellStart"/>
+      <w:r>
+        <w:rPr>
+          <w:rFonts w:ascii="Times New Roman" w:hAnsi="Times New Roman" w:cs="Times New Roman"/>
+        </w:rPr>
+        <w:t>aggro</w:t>
+      </w:r>
+      <w:proofErr w:type="spellEnd"/>
+      <w:r>
+        <w:rPr>
+          <w:rFonts w:ascii="Times New Roman" w:hAnsi="Times New Roman" w:cs="Times New Roman"/>
+        </w:rPr>
+        <w:t xml:space="preserve"> commands algorithm</w:t>
       </w:r>
     </w:p>
     <w:p>

</xml_diff>

<commit_message>
added removal of physical entities after they go out of world bounds
</commit_message>
<xml_diff>
--- a/documentation/docs/BACKLOG.docx
+++ b/documentation/docs/BACKLOG.docx
@@ -193,6 +193,51 @@
           <w:rFonts w:ascii="Times New Roman" w:hAnsi="Times New Roman" w:cs="Times New Roman"/>
           <w:strike/>
         </w:rPr>
+        <w:t xml:space="preserve">+ when entity is </w:t>
+      </w:r>
+      <w:proofErr w:type="spellStart"/>
+      <w:r>
+        <w:rPr>
+          <w:rFonts w:ascii="Times New Roman" w:hAnsi="Times New Roman" w:cs="Times New Roman"/>
+          <w:strike/>
+        </w:rPr>
+        <w:t>jump_descending</w:t>
+      </w:r>
+      <w:proofErr w:type="spellEnd"/>
+      <w:r>
+        <w:rPr>
+          <w:rFonts w:ascii="Times New Roman" w:hAnsi="Times New Roman" w:cs="Times New Roman"/>
+          <w:strike/>
+        </w:rPr>
+        <w:t xml:space="preserve"> and player moves left or right the state does not switch to </w:t>
+      </w:r>
+      <w:proofErr w:type="spellStart"/>
+      <w:r>
+        <w:rPr>
+          <w:rFonts w:ascii="Times New Roman" w:hAnsi="Times New Roman" w:cs="Times New Roman"/>
+          <w:strike/>
+        </w:rPr>
+        <w:t>overall_descending</w:t>
+      </w:r>
+      <w:proofErr w:type="spellEnd"/>
+      <w:r>
+        <w:rPr>
+          <w:rFonts w:ascii="Times New Roman" w:hAnsi="Times New Roman" w:cs="Times New Roman"/>
+        </w:rPr>
+        <w:t xml:space="preserve"> 10.08.2025</w:t>
+      </w:r>
+    </w:p>
+    <w:p>
+      <w:pPr>
+        <w:rPr>
+          <w:rFonts w:ascii="Times New Roman" w:hAnsi="Times New Roman" w:cs="Times New Roman"/>
+        </w:rPr>
+      </w:pPr>
+      <w:r>
+        <w:rPr>
+          <w:rFonts w:ascii="Times New Roman" w:hAnsi="Times New Roman" w:cs="Times New Roman"/>
+          <w:strike/>
+        </w:rPr>
         <w:t xml:space="preserve">+ when block </w:t>
       </w:r>
       <w:proofErr w:type="spellStart"/>
@@ -254,51 +299,6 @@
           <w:rFonts w:ascii="Times New Roman" w:hAnsi="Times New Roman" w:cs="Times New Roman"/>
         </w:rPr>
         <w:t>10.08.2025</w:t>
-      </w:r>
-    </w:p>
-    <w:p>
-      <w:pPr>
-        <w:rPr>
-          <w:rFonts w:ascii="Times New Roman" w:hAnsi="Times New Roman" w:cs="Times New Roman"/>
-        </w:rPr>
-      </w:pPr>
-      <w:r>
-        <w:rPr>
-          <w:rFonts w:ascii="Times New Roman" w:hAnsi="Times New Roman" w:cs="Times New Roman"/>
-          <w:strike/>
-        </w:rPr>
-        <w:t xml:space="preserve">+ when entity is </w:t>
-      </w:r>
-      <w:proofErr w:type="spellStart"/>
-      <w:r>
-        <w:rPr>
-          <w:rFonts w:ascii="Times New Roman" w:hAnsi="Times New Roman" w:cs="Times New Roman"/>
-          <w:strike/>
-        </w:rPr>
-        <w:t>jump_descending</w:t>
-      </w:r>
-      <w:proofErr w:type="spellEnd"/>
-      <w:r>
-        <w:rPr>
-          <w:rFonts w:ascii="Times New Roman" w:hAnsi="Times New Roman" w:cs="Times New Roman"/>
-          <w:strike/>
-        </w:rPr>
-        <w:t xml:space="preserve"> and player moves left or right the state does not switch to </w:t>
-      </w:r>
-      <w:proofErr w:type="spellStart"/>
-      <w:r>
-        <w:rPr>
-          <w:rFonts w:ascii="Times New Roman" w:hAnsi="Times New Roman" w:cs="Times New Roman"/>
-          <w:strike/>
-        </w:rPr>
-        <w:t>overall_descending</w:t>
-      </w:r>
-      <w:proofErr w:type="spellEnd"/>
-      <w:r>
-        <w:rPr>
-          <w:rFonts w:ascii="Times New Roman" w:hAnsi="Times New Roman" w:cs="Times New Roman"/>
-        </w:rPr>
-        <w:t xml:space="preserve"> 10.08.2025</w:t>
       </w:r>
     </w:p>
     <w:p>

</xml_diff>

<commit_message>
entity out of bounds hotfix and bugfix/ serious memory leak from unknown source
</commit_message>
<xml_diff>
--- a/documentation/docs/BACKLOG.docx
+++ b/documentation/docs/BACKLOG.docx
@@ -113,15 +113,30 @@
       <w:r>
         <w:rPr>
           <w:rFonts w:ascii="Times New Roman" w:hAnsi="Times New Roman" w:cs="Times New Roman"/>
+          <w:strike/>
         </w:rPr>
         <w:t xml:space="preserve">+ </w:t>
       </w:r>
       <w:r>
         <w:rPr>
           <w:rFonts w:ascii="Times New Roman" w:hAnsi="Times New Roman" w:cs="Times New Roman"/>
+          <w:strike/>
         </w:rPr>
         <w:t>serious memory leak from unknown source</w:t>
       </w:r>
+      <w:r>
+        <w:rPr>
+          <w:rFonts w:ascii="Times New Roman" w:hAnsi="Times New Roman" w:cs="Times New Roman"/>
+          <w:strike/>
+        </w:rPr>
+        <w:t xml:space="preserve"> </w:t>
+      </w:r>
+      <w:r>
+        <w:rPr>
+          <w:rFonts w:ascii="Times New Roman" w:hAnsi="Times New Roman" w:cs="Times New Roman"/>
+        </w:rPr>
+        <w:t>10.08.2025</w:t>
+      </w:r>
     </w:p>
     <w:p>
       <w:pPr>
@@ -193,100 +208,27 @@
           <w:rFonts w:ascii="Times New Roman" w:hAnsi="Times New Roman" w:cs="Times New Roman"/>
           <w:strike/>
         </w:rPr>
-        <w:t xml:space="preserve">+ when entity is </w:t>
-      </w:r>
-      <w:proofErr w:type="spellStart"/>
+        <w:t>+ when entity is jump_descending and player moves left or right the state does not switch to overall_descending</w:t>
+      </w:r>
+      <w:r>
+        <w:rPr>
+          <w:rFonts w:ascii="Times New Roman" w:hAnsi="Times New Roman" w:cs="Times New Roman"/>
+        </w:rPr>
+        <w:t xml:space="preserve"> 10.08.2025</w:t>
+      </w:r>
+    </w:p>
+    <w:p>
+      <w:pPr>
+        <w:rPr>
+          <w:rFonts w:ascii="Times New Roman" w:hAnsi="Times New Roman" w:cs="Times New Roman"/>
+        </w:rPr>
+      </w:pPr>
       <w:r>
         <w:rPr>
           <w:rFonts w:ascii="Times New Roman" w:hAnsi="Times New Roman" w:cs="Times New Roman"/>
           <w:strike/>
         </w:rPr>
-        <w:t>jump_descending</w:t>
-      </w:r>
-      <w:proofErr w:type="spellEnd"/>
-      <w:r>
-        <w:rPr>
-          <w:rFonts w:ascii="Times New Roman" w:hAnsi="Times New Roman" w:cs="Times New Roman"/>
-          <w:strike/>
-        </w:rPr>
-        <w:t xml:space="preserve"> and player moves left or right the state does not switch to </w:t>
-      </w:r>
-      <w:proofErr w:type="spellStart"/>
-      <w:r>
-        <w:rPr>
-          <w:rFonts w:ascii="Times New Roman" w:hAnsi="Times New Roman" w:cs="Times New Roman"/>
-          <w:strike/>
-        </w:rPr>
-        <w:t>overall_descending</w:t>
-      </w:r>
-      <w:proofErr w:type="spellEnd"/>
-      <w:r>
-        <w:rPr>
-          <w:rFonts w:ascii="Times New Roman" w:hAnsi="Times New Roman" w:cs="Times New Roman"/>
-        </w:rPr>
-        <w:t xml:space="preserve"> 10.08.2025</w:t>
-      </w:r>
-    </w:p>
-    <w:p>
-      <w:pPr>
-        <w:rPr>
-          <w:rFonts w:ascii="Times New Roman" w:hAnsi="Times New Roman" w:cs="Times New Roman"/>
-        </w:rPr>
-      </w:pPr>
-      <w:r>
-        <w:rPr>
-          <w:rFonts w:ascii="Times New Roman" w:hAnsi="Times New Roman" w:cs="Times New Roman"/>
-          <w:strike/>
-        </w:rPr>
-        <w:t xml:space="preserve">+ when block </w:t>
-      </w:r>
-      <w:proofErr w:type="spellStart"/>
-      <w:r>
-        <w:rPr>
-          <w:rFonts w:ascii="Times New Roman" w:hAnsi="Times New Roman" w:cs="Times New Roman"/>
-          <w:strike/>
-        </w:rPr>
-        <w:t>modelstate</w:t>
-      </w:r>
-      <w:proofErr w:type="spellEnd"/>
-      <w:r>
-        <w:rPr>
-          <w:rFonts w:ascii="Times New Roman" w:hAnsi="Times New Roman" w:cs="Times New Roman"/>
-          <w:strike/>
-        </w:rPr>
-        <w:t xml:space="preserve"> and </w:t>
-      </w:r>
-      <w:proofErr w:type="spellStart"/>
-      <w:r>
-        <w:rPr>
-          <w:rFonts w:ascii="Times New Roman" w:hAnsi="Times New Roman" w:cs="Times New Roman"/>
-          <w:strike/>
-        </w:rPr>
-        <w:t>blockpressed</w:t>
-      </w:r>
-      <w:proofErr w:type="spellEnd"/>
-      <w:r>
-        <w:rPr>
-          <w:rFonts w:ascii="Times New Roman" w:hAnsi="Times New Roman" w:cs="Times New Roman"/>
-          <w:strike/>
-        </w:rPr>
-        <w:t xml:space="preserve"> released the block </w:t>
-      </w:r>
-      <w:proofErr w:type="spellStart"/>
-      <w:r>
-        <w:rPr>
-          <w:rFonts w:ascii="Times New Roman" w:hAnsi="Times New Roman" w:cs="Times New Roman"/>
-          <w:strike/>
-        </w:rPr>
-        <w:t>modelstate</w:t>
-      </w:r>
-      <w:proofErr w:type="spellEnd"/>
-      <w:r>
-        <w:rPr>
-          <w:rFonts w:ascii="Times New Roman" w:hAnsi="Times New Roman" w:cs="Times New Roman"/>
-          <w:strike/>
-        </w:rPr>
-        <w:t xml:space="preserve"> stays on</w:t>
+        <w:t>+ when block modelstate and blockpressed released the block modelstate stays on</w:t>
       </w:r>
       <w:r>
         <w:rPr>
@@ -350,49 +292,7 @@
         <w:rPr>
           <w:rFonts w:ascii="Times New Roman" w:hAnsi="Times New Roman" w:cs="Times New Roman"/>
         </w:rPr>
-        <w:t xml:space="preserve">+ entities while ai switching to </w:t>
-      </w:r>
-      <w:proofErr w:type="spellStart"/>
-      <w:r>
-        <w:rPr>
-          <w:rFonts w:ascii="Times New Roman" w:hAnsi="Times New Roman" w:cs="Times New Roman"/>
-        </w:rPr>
-        <w:t>aggro</w:t>
-      </w:r>
-      <w:proofErr w:type="spellEnd"/>
-      <w:r>
-        <w:rPr>
-          <w:rFonts w:ascii="Times New Roman" w:hAnsi="Times New Roman" w:cs="Times New Roman"/>
-        </w:rPr>
-        <w:t xml:space="preserve"> </w:t>
-      </w:r>
-      <w:proofErr w:type="spellStart"/>
-      <w:r>
-        <w:rPr>
-          <w:rFonts w:ascii="Times New Roman" w:hAnsi="Times New Roman" w:cs="Times New Roman"/>
-        </w:rPr>
-        <w:t>behaviour</w:t>
-      </w:r>
-      <w:proofErr w:type="spellEnd"/>
-      <w:r>
-        <w:rPr>
-          <w:rFonts w:ascii="Times New Roman" w:hAnsi="Times New Roman" w:cs="Times New Roman"/>
-        </w:rPr>
-        <w:t xml:space="preserve"> case don’t instantly perform </w:t>
-      </w:r>
-      <w:proofErr w:type="spellStart"/>
-      <w:r>
-        <w:rPr>
-          <w:rFonts w:ascii="Times New Roman" w:hAnsi="Times New Roman" w:cs="Times New Roman"/>
-        </w:rPr>
-        <w:t>aggro</w:t>
-      </w:r>
-      <w:proofErr w:type="spellEnd"/>
-      <w:r>
-        <w:rPr>
-          <w:rFonts w:ascii="Times New Roman" w:hAnsi="Times New Roman" w:cs="Times New Roman"/>
-        </w:rPr>
-        <w:t xml:space="preserve"> commands algorithm</w:t>
+        <w:t>+ entities while ai switching to aggro behaviour case don’t instantly perform aggro commands algorithm</w:t>
       </w:r>
     </w:p>
     <w:p>

</xml_diff>

<commit_message>
documentation files hierarchy reorganization
</commit_message>
<xml_diff>
--- a/documentation/docs/BACKLOG.docx
+++ b/documentation/docs/BACKLOG.docx
@@ -108,17 +108,20 @@
       <w:pPr>
         <w:rPr>
           <w:rFonts w:ascii="Times New Roman" w:hAnsi="Times New Roman" w:cs="Times New Roman"/>
-        </w:rPr>
-      </w:pPr>
-      <w:r>
-        <w:rPr>
-          <w:rFonts w:ascii="Times New Roman" w:hAnsi="Times New Roman" w:cs="Times New Roman"/>
+          <w:strike/>
+        </w:rPr>
+      </w:pPr>
+      <w:r>
+        <w:rPr>
+          <w:rFonts w:ascii="Times New Roman" w:hAnsi="Times New Roman" w:cs="Times New Roman"/>
+          <w:strike/>
         </w:rPr>
         <w:t xml:space="preserve">+ </w:t>
       </w:r>
       <w:r>
         <w:rPr>
           <w:rFonts w:ascii="Times New Roman" w:hAnsi="Times New Roman" w:cs="Times New Roman"/>
+          <w:strike/>
         </w:rPr>
         <w:t>serious memory leak from unknown source</w:t>
       </w:r>
@@ -147,17 +150,20 @@
       <w:pPr>
         <w:rPr>
           <w:rFonts w:ascii="Times New Roman" w:hAnsi="Times New Roman" w:cs="Times New Roman"/>
-        </w:rPr>
-      </w:pPr>
-      <w:r>
-        <w:rPr>
-          <w:rFonts w:ascii="Times New Roman" w:hAnsi="Times New Roman" w:cs="Times New Roman"/>
+          <w:strike/>
+        </w:rPr>
+      </w:pPr>
+      <w:r>
+        <w:rPr>
+          <w:rFonts w:ascii="Times New Roman" w:hAnsi="Times New Roman" w:cs="Times New Roman"/>
+          <w:strike/>
         </w:rPr>
         <w:t xml:space="preserve">+ </w:t>
       </w:r>
       <w:r>
         <w:rPr>
           <w:rFonts w:ascii="Times New Roman" w:hAnsi="Times New Roman" w:cs="Times New Roman"/>
+          <w:strike/>
         </w:rPr>
         <w:t>input is overall enabled when game window is not active and when the cursor is out of the game window</w:t>
       </w:r>
@@ -193,8 +199,33 @@
           <w:rFonts w:ascii="Times New Roman" w:hAnsi="Times New Roman" w:cs="Times New Roman"/>
           <w:strike/>
         </w:rPr>
-        <w:t>+ when entity is jump_descending and player moves left or right the state does not switch to overall_descending</w:t>
-      </w:r>
+        <w:t xml:space="preserve">+ when entity is </w:t>
+      </w:r>
+      <w:proofErr w:type="spellStart"/>
+      <w:r>
+        <w:rPr>
+          <w:rFonts w:ascii="Times New Roman" w:hAnsi="Times New Roman" w:cs="Times New Roman"/>
+          <w:strike/>
+        </w:rPr>
+        <w:t>jump_descending</w:t>
+      </w:r>
+      <w:proofErr w:type="spellEnd"/>
+      <w:r>
+        <w:rPr>
+          <w:rFonts w:ascii="Times New Roman" w:hAnsi="Times New Roman" w:cs="Times New Roman"/>
+          <w:strike/>
+        </w:rPr>
+        <w:t xml:space="preserve"> and player moves left or right the state does not switch to </w:t>
+      </w:r>
+      <w:proofErr w:type="spellStart"/>
+      <w:r>
+        <w:rPr>
+          <w:rFonts w:ascii="Times New Roman" w:hAnsi="Times New Roman" w:cs="Times New Roman"/>
+          <w:strike/>
+        </w:rPr>
+        <w:t>overall_descending</w:t>
+      </w:r>
+      <w:proofErr w:type="spellEnd"/>
       <w:r>
         <w:rPr>
           <w:rFonts w:ascii="Times New Roman" w:hAnsi="Times New Roman" w:cs="Times New Roman"/>
@@ -213,7 +244,55 @@
           <w:rFonts w:ascii="Times New Roman" w:hAnsi="Times New Roman" w:cs="Times New Roman"/>
           <w:strike/>
         </w:rPr>
-        <w:t>+ when block modelstate and blockpressed released the block modelstate stays on</w:t>
+        <w:t xml:space="preserve">+ when block </w:t>
+      </w:r>
+      <w:proofErr w:type="spellStart"/>
+      <w:r>
+        <w:rPr>
+          <w:rFonts w:ascii="Times New Roman" w:hAnsi="Times New Roman" w:cs="Times New Roman"/>
+          <w:strike/>
+        </w:rPr>
+        <w:t>modelstate</w:t>
+      </w:r>
+      <w:proofErr w:type="spellEnd"/>
+      <w:r>
+        <w:rPr>
+          <w:rFonts w:ascii="Times New Roman" w:hAnsi="Times New Roman" w:cs="Times New Roman"/>
+          <w:strike/>
+        </w:rPr>
+        <w:t xml:space="preserve"> and </w:t>
+      </w:r>
+      <w:proofErr w:type="spellStart"/>
+      <w:r>
+        <w:rPr>
+          <w:rFonts w:ascii="Times New Roman" w:hAnsi="Times New Roman" w:cs="Times New Roman"/>
+          <w:strike/>
+        </w:rPr>
+        <w:t>blockpressed</w:t>
+      </w:r>
+      <w:proofErr w:type="spellEnd"/>
+      <w:r>
+        <w:rPr>
+          <w:rFonts w:ascii="Times New Roman" w:hAnsi="Times New Roman" w:cs="Times New Roman"/>
+          <w:strike/>
+        </w:rPr>
+        <w:t xml:space="preserve"> released the block </w:t>
+      </w:r>
+      <w:proofErr w:type="spellStart"/>
+      <w:r>
+        <w:rPr>
+          <w:rFonts w:ascii="Times New Roman" w:hAnsi="Times New Roman" w:cs="Times New Roman"/>
+          <w:strike/>
+        </w:rPr>
+        <w:t>modelstate</w:t>
+      </w:r>
+      <w:proofErr w:type="spellEnd"/>
+      <w:r>
+        <w:rPr>
+          <w:rFonts w:ascii="Times New Roman" w:hAnsi="Times New Roman" w:cs="Times New Roman"/>
+          <w:strike/>
+        </w:rPr>
+        <w:t xml:space="preserve"> stays on</w:t>
       </w:r>
       <w:r>
         <w:rPr>
@@ -258,12 +337,14 @@
       <w:pPr>
         <w:rPr>
           <w:rFonts w:ascii="Times New Roman" w:hAnsi="Times New Roman" w:cs="Times New Roman"/>
+          <w:strike/>
           <w:lang w:val="uk-UA"/>
         </w:rPr>
       </w:pPr>
       <w:r>
         <w:rPr>
           <w:rFonts w:ascii="Times New Roman" w:hAnsi="Times New Roman" w:cs="Times New Roman"/>
+          <w:strike/>
         </w:rPr>
         <w:t>+ entities while ai moving fall from surface edges</w:t>
       </w:r>
@@ -278,18 +359,62 @@
         <w:rPr>
           <w:rFonts w:ascii="Times New Roman" w:hAnsi="Times New Roman" w:cs="Times New Roman"/>
         </w:rPr>
-        <w:t>+ entities while ai switching to aggro behaviour case don’t instantly perform aggro commands algorithm</w:t>
-      </w:r>
-    </w:p>
-    <w:p>
-      <w:pPr>
-        <w:rPr>
-          <w:rFonts w:ascii="Times New Roman" w:hAnsi="Times New Roman" w:cs="Times New Roman"/>
-        </w:rPr>
-      </w:pPr>
-      <w:r>
-        <w:rPr>
-          <w:rFonts w:ascii="Times New Roman" w:hAnsi="Times New Roman" w:cs="Times New Roman"/>
+        <w:t xml:space="preserve">+ entities while ai switching to </w:t>
+      </w:r>
+      <w:proofErr w:type="spellStart"/>
+      <w:r>
+        <w:rPr>
+          <w:rFonts w:ascii="Times New Roman" w:hAnsi="Times New Roman" w:cs="Times New Roman"/>
+        </w:rPr>
+        <w:t>aggro</w:t>
+      </w:r>
+      <w:proofErr w:type="spellEnd"/>
+      <w:r>
+        <w:rPr>
+          <w:rFonts w:ascii="Times New Roman" w:hAnsi="Times New Roman" w:cs="Times New Roman"/>
+        </w:rPr>
+        <w:t xml:space="preserve"> </w:t>
+      </w:r>
+      <w:proofErr w:type="spellStart"/>
+      <w:r>
+        <w:rPr>
+          <w:rFonts w:ascii="Times New Roman" w:hAnsi="Times New Roman" w:cs="Times New Roman"/>
+        </w:rPr>
+        <w:t>behaviour</w:t>
+      </w:r>
+      <w:proofErr w:type="spellEnd"/>
+      <w:r>
+        <w:rPr>
+          <w:rFonts w:ascii="Times New Roman" w:hAnsi="Times New Roman" w:cs="Times New Roman"/>
+        </w:rPr>
+        <w:t xml:space="preserve"> case don’t instantly perform </w:t>
+      </w:r>
+      <w:proofErr w:type="spellStart"/>
+      <w:r>
+        <w:rPr>
+          <w:rFonts w:ascii="Times New Roman" w:hAnsi="Times New Roman" w:cs="Times New Roman"/>
+        </w:rPr>
+        <w:t>aggro</w:t>
+      </w:r>
+      <w:proofErr w:type="spellEnd"/>
+      <w:r>
+        <w:rPr>
+          <w:rFonts w:ascii="Times New Roman" w:hAnsi="Times New Roman" w:cs="Times New Roman"/>
+        </w:rPr>
+        <w:t xml:space="preserve"> commands algorithm</w:t>
+      </w:r>
+    </w:p>
+    <w:p>
+      <w:pPr>
+        <w:rPr>
+          <w:rFonts w:ascii="Times New Roman" w:hAnsi="Times New Roman" w:cs="Times New Roman"/>
+          <w:strike/>
+        </w:rPr>
+      </w:pPr>
+      <w:r>
+        <w:rPr>
+          <w:rFonts w:ascii="Times New Roman" w:hAnsi="Times New Roman" w:cs="Times New Roman"/>
+          <w:strike/>
         </w:rPr>
         <w:t>+ check poise loss =&gt; allow body rotation process</w:t>
       </w:r>

</xml_diff>